<commit_message>
Add Garage Tips article 19: Understanding Kickback
Cuts three photo placeholders that turned out to have no real on-topic
Pexels/Pixabay match (riving knife, push stick, combination square) per
house rule, regenerates the docx, and publishes the article live for the
first time via a new UPDATE-or-INSERT SQL script.

Co-Authored-By: Claude Sonnet 5 <noreply@anthropic.com>
</commit_message>
<xml_diff>
--- a/Articles/19-understanding-kickback-D/article.docx
+++ b/Articles/19-understanding-kickback-D/article.docx
@@ -227,22 +227,6 @@
     </w:p>
     <w:p>
       <w:pPr>
-        <w:pBdr>
-          <w:top w:val="single" w:sz="6" w:space="8" w:color="D8D2C2"/>
-          <w:bottom w:val="single" w:sz="6" w:space="8" w:color="D8D2C2"/>
-        </w:pBdr>
-        <w:spacing w:before="160" w:after="160"/>
-      </w:pPr>
-      <w:r>
-        <w:rPr>
-          <w:i/>
-          <w:color w:val="6B6456"/>
-        </w:rPr>
-        <w:t xml:space="preserve">📷 Photo placeholder — a riving knife correctly positioned directly behind the blade, coplanar and close, showing the small gap that keeps the kerf from closing on the blade.</w:t>
-      </w:r>
-    </w:p>
-    <w:p>
-      <w:pPr>
         <w:pStyle w:val="Heading1"/>
       </w:pPr>
       <w:r>
@@ -282,22 +266,6 @@
       </w:r>
     </w:p>
     <w:p>
-      <w:pPr>
-        <w:pBdr>
-          <w:top w:val="single" w:sz="6" w:space="8" w:color="D8D2C2"/>
-          <w:bottom w:val="single" w:sz="6" w:space="8" w:color="D8D2C2"/>
-        </w:pBdr>
-        <w:spacing w:before="160" w:after="160"/>
-      </w:pPr>
-      <w:r>
-        <w:rPr>
-          <w:i/>
-          <w:color w:val="6B6456"/>
-        </w:rPr>
-        <w:t xml:space="preserve">📷 Photo placeholder — a push stick in use finishing a rip cut, hand well clear of the blade, notch hooked over the trailing edge of the workpiece.</w:t>
-      </w:r>
-    </w:p>
-    <w:p>
       <w:r>
         <w:t xml:space="preserve">Never stand directly in line with the blade. Every single cut, take the half-step to the side before you start feeding stock. It costs nothing, and it's the one habit on this entire list that protects you even when everything else goes wrong.</w:t>
       </w:r>
@@ -315,22 +283,6 @@
     <w:p>
       <w:r>
         <w:t xml:space="preserve">Flesh-detection saw technology, as a category, not any one brand, is worth taking seriously if you're shopping for a saw right now. It doesn't prevent kickback directly, but it's a real, proven layer of protection for the moment things go wrong that no amount of technique can fully guarantee against on its own.</w:t>
-      </w:r>
-    </w:p>
-    <w:p>
-      <w:pPr>
-        <w:pBdr>
-          <w:top w:val="single" w:sz="6" w:space="8" w:color="D8D2C2"/>
-          <w:bottom w:val="single" w:sz="6" w:space="8" w:color="D8D2C2"/>
-        </w:pBdr>
-        <w:spacing w:before="160" w:after="160"/>
-      </w:pPr>
-      <w:r>
-        <w:rPr>
-          <w:i/>
-          <w:color w:val="6B6456"/>
-        </w:rPr>
-        <w:t xml:space="preserve">📷 Photo placeholder — a combination square measuring the gap between the rip fence and the miter slot at the front and back of the table, checking for toe-in.</w:t>
       </w:r>
     </w:p>
     <w:p>

</xml_diff>